<commit_message>
feat(TOR): add Judul Program RKA + Tujuan Umum/Khusus split + signature block
- Wizard form: order matches spec (ID TOR, Judul Program RKA dropdown,
  Judul Kegiatan auto-fill, Kategori auto-fill), then Latar Belakang,
  Tujuan (a. Umum / b. Khusus), Sasaran, Rencana Kegiatan
  (a. Hari/Tanggal, b. Tempat, c. Narasumber)
- Template_TOR.docx: insert {judulProgramRKA} title before {judulKegiatan}
  (both centered under RINGKASAN KEGIATAN); split TUJUAN into
  "a. Tujuan Umum" ({tujuanUmum} plain text) and "b. Tujuan Khusus"
  ({#tujuanKhususList} loop); append signature block (Pembuat: Officer
  Community Development / Wahyu Andrias | Menyetujui: Assistant
  Manager KAS / Astri Oktavina)
- App.jsx DOCX_TEMPLATES.tor.buildData: pass judulProgramRKA,
  tujuanUmum, and tujuanKhususList separately
- TorDocPreview: mirror the new document layout (two titles, split
  Tujuan section, signature block)
</commit_message>
<xml_diff>
--- a/public/templates/Template_TOR.docx
+++ b/public/templates/Template_TOR.docx
@@ -30,6 +30,30 @@
           <w:szCs w:val="24"/>
         </w:rPr>
         <w:t>KEGIATAN</w:t>
+      </w:r>
+    </w:p>
+    <w:p>
+      <w:pPr>
+        <w:spacing w:before="182" w:line="276" w:lineRule="auto"/>
+        <w:ind w:right="359"/>
+        <w:jc w:val="center"/>
+        <w:rPr>
+          <w:rFonts w:cs="Arial"/>
+          <w:b/>
+          <w:sz w:val="24"/>
+          <w:szCs w:val="24"/>
+          <w:lang w:val="en-US"/>
+        </w:rPr>
+      </w:pPr>
+      <w:r>
+        <w:rPr>
+          <w:b/>
+          <w:noProof/>
+          <w:sz w:val="24"/>
+          <w:szCs w:val="24"/>
+          <w:lang w:val="en-US"/>
+        </w:rPr>
+        <w:t>{judulProgramRKA}</w:t>
       </w:r>
     </w:p>
     <w:p>
@@ -182,6 +206,72 @@
     </w:p>
     <w:p>
       <w:pPr>
+        <w:widowControl/>
+        <w:autoSpaceDE/>
+        <w:autoSpaceDN/>
+        <w:spacing w:line="276" w:lineRule="auto"/>
+        <w:jc w:val="both"/>
+        <w:rPr>
+          <w:rFonts w:eastAsia="Times New Roman" w:cs="Times New Roman"/>
+          <w:sz w:val="24"/>
+          <w:szCs w:val="24"/>
+          <w:lang w:val="en-US"/>
+        </w:rPr>
+      </w:pPr>
+      <w:r>
+        <w:rPr>
+          <w:sz w:val="24"/>
+          <w:szCs w:val="24"/>
+        </w:rPr>
+        <w:t xml:space="preserve">a. Tujuan Umum</w:t>
+      </w:r>
+    </w:p>
+    <w:p>
+      <w:pPr>
+        <w:widowControl/>
+        <w:autoSpaceDE/>
+        <w:autoSpaceDN/>
+        <w:spacing w:line="276" w:lineRule="auto"/>
+        <w:jc w:val="both"/>
+        <w:rPr>
+          <w:rFonts w:eastAsia="Times New Roman" w:cs="Times New Roman"/>
+          <w:sz w:val="24"/>
+          <w:szCs w:val="24"/>
+          <w:lang w:val="en-US"/>
+        </w:rPr>
+      </w:pPr>
+      <w:r>
+        <w:rPr>
+          <w:sz w:val="24"/>
+          <w:szCs w:val="24"/>
+        </w:rPr>
+        <w:t xml:space="preserve">{tujuanUmum}</w:t>
+      </w:r>
+    </w:p>
+    <w:p>
+      <w:pPr>
+        <w:widowControl/>
+        <w:autoSpaceDE/>
+        <w:autoSpaceDN/>
+        <w:spacing w:line="276" w:lineRule="auto"/>
+        <w:jc w:val="both"/>
+        <w:rPr>
+          <w:rFonts w:eastAsia="Times New Roman" w:cs="Times New Roman"/>
+          <w:sz w:val="24"/>
+          <w:szCs w:val="24"/>
+          <w:lang w:val="en-US"/>
+        </w:rPr>
+      </w:pPr>
+      <w:r>
+        <w:rPr>
+          <w:sz w:val="24"/>
+          <w:szCs w:val="24"/>
+        </w:rPr>
+        <w:t xml:space="preserve">b. Tujuan Khusus</w:t>
+      </w:r>
+    </w:p>
+    <w:p>
+      <w:pPr>
         <w:pStyle w:val="ListParagraph"/>
         <w:widowControl/>
         <w:numPr>
@@ -207,7 +297,7 @@
           <w:szCs w:val="24"/>
           <w:lang w:val="en-US"/>
         </w:rPr>
-        <w:t>{#tujuanList}</w:t>
+        <w:t>{#tujuanKhususList}</w:t>
       </w:r>
     </w:p>
     <w:p>
@@ -267,7 +357,7 @@
           <w:szCs w:val="24"/>
           <w:lang w:val="en-US"/>
         </w:rPr>
-        <w:t>{/tujuanList}</w:t>
+        <w:t>{/tujuanKhususList}</w:t>
       </w:r>
     </w:p>
     <w:p>
@@ -539,6 +629,186 @@
         </w:rPr>
       </w:pPr>
     </w:p>
+    <w:p>
+      <w:pPr>
+        <w:spacing w:before="480"/>
+      </w:pPr>
+    </w:p>
+    <w:tbl>
+      <w:tblPr>
+        <w:tblW w:type="dxa" w:w="9000"/>
+        <w:jc w:val="center"/>
+        <w:tblBorders>
+          <w:top w:val="none" w:sz="0"/>
+          <w:left w:val="none" w:sz="0"/>
+          <w:bottom w:val="none" w:sz="0"/>
+          <w:right w:val="none" w:sz="0"/>
+          <w:insideH w:val="none" w:sz="0"/>
+          <w:insideV w:val="none" w:sz="0"/>
+        </w:tblBorders>
+        <w:tblLayout w:type="fixed"/>
+      </w:tblPr>
+      <w:tblGrid>
+        <w:gridCol w:w="4500"/>
+        <w:gridCol w:w="4500"/>
+      </w:tblGrid>
+      <w:tr>
+        <w:tc>
+          <w:tcPr>
+            <w:tcW w:type="dxa" w:w="4500"/>
+          </w:tcPr>
+          <w:p>
+            <w:pPr>
+              <w:jc w:val="center"/>
+              <w:spacing w:after="60"/>
+            </w:pPr>
+            <w:r>
+              <w:rPr>
+                <w:sz w:val="22"/>
+                <w:szCs w:val="22"/>
+              </w:rPr>
+              <w:t xml:space="preserve">Pembuat</w:t>
+            </w:r>
+          </w:p>
+        </w:tc>
+        <w:tc>
+          <w:tcPr>
+            <w:tcW w:type="dxa" w:w="4500"/>
+          </w:tcPr>
+          <w:p>
+            <w:pPr>
+              <w:jc w:val="center"/>
+              <w:spacing w:after="60"/>
+            </w:pPr>
+            <w:r>
+              <w:rPr>
+                <w:sz w:val="22"/>
+                <w:szCs w:val="22"/>
+              </w:rPr>
+              <w:t xml:space="preserve">Menyetujui</w:t>
+            </w:r>
+          </w:p>
+        </w:tc>
+      </w:tr>
+      <w:tr>
+        <w:tc>
+          <w:tcPr>
+            <w:tcW w:type="dxa" w:w="4500"/>
+          </w:tcPr>
+          <w:p>
+            <w:pPr>
+              <w:jc w:val="center"/>
+              <w:spacing w:after="60"/>
+            </w:pPr>
+            <w:r>
+              <w:rPr>
+                <w:sz w:val="22"/>
+                <w:szCs w:val="22"/>
+              </w:rPr>
+              <w:t xml:space="preserve">Officer Community Development</w:t>
+            </w:r>
+          </w:p>
+        </w:tc>
+        <w:tc>
+          <w:tcPr>
+            <w:tcW w:type="dxa" w:w="4500"/>
+          </w:tcPr>
+          <w:p>
+            <w:pPr>
+              <w:jc w:val="center"/>
+              <w:spacing w:after="60"/>
+            </w:pPr>
+            <w:r>
+              <w:rPr>
+                <w:sz w:val="22"/>
+                <w:szCs w:val="22"/>
+              </w:rPr>
+              <w:t xml:space="preserve">Assistant Manager KAS</w:t>
+            </w:r>
+          </w:p>
+        </w:tc>
+      </w:tr>
+      <w:tr>
+        <w:tc>
+          <w:tcPr>
+            <w:tcW w:type="dxa" w:w="4500"/>
+          </w:tcPr>
+          <w:p>
+            <w:pPr>
+              <w:jc w:val="center"/>
+            </w:pPr>
+          </w:p>
+          <w:p>
+            <w:pPr>
+              <w:jc w:val="center"/>
+            </w:pPr>
+          </w:p>
+          <w:p>
+            <w:pPr>
+              <w:jc w:val="center"/>
+            </w:pPr>
+          </w:p>
+        </w:tc>
+        <w:tc>
+          <w:tcPr>
+            <w:tcW w:type="dxa" w:w="4500"/>
+          </w:tcPr>
+          <w:p>
+            <w:pPr>
+              <w:jc w:val="center"/>
+            </w:pPr>
+          </w:p>
+          <w:p>
+            <w:pPr>
+              <w:jc w:val="center"/>
+            </w:pPr>
+          </w:p>
+          <w:p>
+            <w:pPr>
+              <w:jc w:val="center"/>
+            </w:pPr>
+          </w:p>
+        </w:tc>
+      </w:tr>
+      <w:tr>
+        <w:tc>
+          <w:tcPr>
+            <w:tcW w:type="dxa" w:w="4500"/>
+          </w:tcPr>
+          <w:p>
+            <w:pPr>
+              <w:jc w:val="center"/>
+              <w:spacing w:after="60"/>
+            </w:pPr>
+            <w:r>
+              <w:rPr>
+                <w:sz w:val="22"/>
+                <w:szCs w:val="22"/>
+              </w:rPr>
+              <w:t xml:space="preserve">Wahyu Andrias</w:t>
+            </w:r>
+          </w:p>
+        </w:tc>
+        <w:tc>
+          <w:tcPr>
+            <w:tcW w:type="dxa" w:w="4500"/>
+          </w:tcPr>
+          <w:p>
+            <w:pPr>
+              <w:jc w:val="center"/>
+              <w:spacing w:after="60"/>
+            </w:pPr>
+            <w:r>
+              <w:rPr>
+                <w:sz w:val="22"/>
+                <w:szCs w:val="22"/>
+              </w:rPr>
+              <w:t xml:space="preserve">Astri Oktavina</w:t>
+            </w:r>
+          </w:p>
+        </w:tc>
+      </w:tr>
+    </w:tbl>
     <w:sectPr>
       <w:pgSz w:w="12240" w:h="15840"/>
       <w:pgMar w:top="1340" w:right="1440" w:bottom="280" w:left="1800" w:header="0" w:footer="0" w:gutter="0"/>

</xml_diff>

<commit_message>
feat(TOR): rebuild template body from blank letterhead
Preserve the PLN letterhead (header banner + Indonesia Power logo) from
the uploaded blank template and reconstruct the entire body content in
code with the agreed TOR structure:

1. RINGKASAN KEGIATAN (bold center 13pt)
2. Two title lines: {judulProgramRKA} + {judulKegiatan} (bold center 11pt)
3. Numbered sections: 1. LATAR BELAKANG, 2. TUJUAN (a. Umum + b. Khusus
   list), 3. SASARAN (list), 4. RENCANA KEGIATAN (a/b/c inline labels)
4. Signature block: Pembuat (Officer Community Development / Wahyu
   Andrias) | Menyetujui (Assistant Manager KAS / Astri Oktavina)

Removes legacy sample content and formatting quirks from the original
docx so what appears in the exported file exactly matches the wizard
input.
</commit_message>
<xml_diff>
--- a/public/templates/Template_TOR.docx
+++ b/public/templates/Template_TOR.docx
@@ -4,634 +4,311 @@
   <w:body>
     <w:p>
       <w:pPr>
-        <w:spacing w:before="82" w:line="276" w:lineRule="auto"/>
-        <w:ind w:right="359"/>
+        <w:spacing w:before="120" w:after="120" w:line="276" w:lineRule="auto"/>
         <w:jc w:val="center"/>
+      </w:pPr>
+      <w:r>
         <w:rPr>
+          <w:rFonts w:ascii="Arial" w:hAnsi="Arial" w:cs="Arial"/>
+          <w:sz w:val="26"/>
+          <w:szCs w:val="26"/>
           <w:b/>
-          <w:sz w:val="24"/>
-          <w:szCs w:val="24"/>
+          <w:bCs/>
         </w:rPr>
-      </w:pPr>
-      <w:bookmarkStart w:id="0" w:name="_GoBack"/>
+        <w:t xml:space="preserve">RINGKASAN KEGIATAN</w:t>
+      </w:r>
+    </w:p>
+    <w:p>
+      <w:pPr>
+        <w:spacing w:before="0" w:after="60" w:line="276" w:lineRule="auto"/>
+        <w:jc w:val="center"/>
+      </w:pPr>
       <w:r>
         <w:rPr>
+          <w:rFonts w:ascii="Arial" w:hAnsi="Arial" w:cs="Arial"/>
+          <w:sz w:val="22"/>
+          <w:szCs w:val="22"/>
           <w:b/>
-          <w:sz w:val="24"/>
-          <w:szCs w:val="24"/>
+          <w:bCs/>
         </w:rPr>
-        <w:t xml:space="preserve">RINGKASAN </w:t>
-      </w:r>
+        <w:t xml:space="preserve">{judulProgramRKA}</w:t>
+      </w:r>
+    </w:p>
+    <w:p>
+      <w:pPr>
+        <w:spacing w:before="0" w:after="180" w:line="276" w:lineRule="auto"/>
+        <w:jc w:val="center"/>
+      </w:pPr>
       <w:r>
         <w:rPr>
+          <w:rFonts w:ascii="Arial" w:hAnsi="Arial" w:cs="Arial"/>
+          <w:sz w:val="22"/>
+          <w:szCs w:val="22"/>
           <w:b/>
-          <w:spacing w:val="-2"/>
-          <w:sz w:val="24"/>
-          <w:szCs w:val="24"/>
+          <w:bCs/>
         </w:rPr>
-        <w:t>KEGIATAN</w:t>
-      </w:r>
-    </w:p>
-    <w:p>
-      <w:pPr>
-        <w:spacing w:before="182" w:line="276" w:lineRule="auto"/>
-        <w:ind w:right="359"/>
-        <w:jc w:val="center"/>
+        <w:t xml:space="preserve">{judulKegiatan}</w:t>
+      </w:r>
+    </w:p>
+    <w:p>
+      <w:pPr>
+        <w:spacing w:before="240" w:after="120" w:line="276" w:lineRule="auto"/>
+        <w:keepNext/>
+      </w:pPr>
+      <w:r>
         <w:rPr>
-          <w:rFonts w:cs="Arial"/>
+          <w:rFonts w:ascii="Arial" w:hAnsi="Arial" w:cs="Arial"/>
           <w:b/>
-          <w:sz w:val="24"/>
-          <w:szCs w:val="24"/>
-          <w:lang w:val="en-US"/>
+          <w:bCs/>
+          <w:sz w:val="22"/>
+          <w:szCs w:val="22"/>
         </w:rPr>
+        <w:t xml:space="preserve">1. LATAR BELAKANG</w:t>
+      </w:r>
+    </w:p>
+    <w:p>
+      <w:pPr>
+        <w:spacing w:before="0" w:after="120" w:line="276" w:lineRule="auto"/>
+        <w:ind w:left="360"/>
+        <w:jc w:val="both"/>
       </w:pPr>
       <w:r>
         <w:rPr>
+          <w:rFonts w:ascii="Arial" w:hAnsi="Arial" w:cs="Arial"/>
+          <w:sz w:val="22"/>
+          <w:szCs w:val="22"/>
+        </w:rPr>
+        <w:t xml:space="preserve">{latarBelakang}</w:t>
+      </w:r>
+    </w:p>
+    <w:p>
+      <w:pPr>
+        <w:spacing w:before="240" w:after="120" w:line="276" w:lineRule="auto"/>
+        <w:keepNext/>
+      </w:pPr>
+      <w:r>
+        <w:rPr>
+          <w:rFonts w:ascii="Arial" w:hAnsi="Arial" w:cs="Arial"/>
           <w:b/>
-          <w:noProof/>
-          <w:sz w:val="24"/>
-          <w:szCs w:val="24"/>
-          <w:lang w:val="en-US"/>
+          <w:bCs/>
+          <w:sz w:val="22"/>
+          <w:szCs w:val="22"/>
         </w:rPr>
-        <w:t>{judulProgramRKA}</w:t>
-      </w:r>
-    </w:p>
-    <w:p>
-      <w:pPr>
-        <w:spacing w:before="182" w:line="276" w:lineRule="auto"/>
-        <w:ind w:right="359"/>
-        <w:jc w:val="center"/>
+        <w:t xml:space="preserve">2. TUJUAN</w:t>
+      </w:r>
+    </w:p>
+    <w:p>
+      <w:pPr>
+        <w:spacing w:before="0" w:after="60" w:line="276" w:lineRule="auto"/>
+        <w:ind w:left="360"/>
+        <w:keepNext/>
+      </w:pPr>
+      <w:r>
         <w:rPr>
-          <w:rFonts w:cs="Arial"/>
-          <w:b/>
-          <w:sz w:val="24"/>
-          <w:szCs w:val="24"/>
-          <w:lang w:val="en-US"/>
-        </w:rPr>
-      </w:pPr>
-      <w:r>
-        <w:rPr>
-          <w:b/>
-          <w:noProof/>
-          <w:sz w:val="24"/>
-          <w:szCs w:val="24"/>
-          <w:lang w:val="en-US"/>
-        </w:rPr>
-        <w:t>{judulKegiatan}</w:t>
-      </w:r>
-    </w:p>
-    <w:bookmarkEnd w:id="0"/>
-    <w:p>
-      <w:pPr>
-        <w:pStyle w:val="BodyText"/>
-        <w:spacing w:before="87" w:line="276" w:lineRule="auto"/>
-        <w:jc w:val="both"/>
-        <w:rPr>
-          <w:b/>
-        </w:rPr>
-      </w:pPr>
-    </w:p>
-    <w:p>
-      <w:pPr>
-        <w:pStyle w:val="ListParagraph"/>
-        <w:numPr>
-          <w:ilvl w:val="0"/>
-          <w:numId w:val="1"/>
-        </w:numPr>
-        <w:spacing w:line="276" w:lineRule="auto"/>
-        <w:ind w:left="284" w:hanging="359"/>
-        <w:jc w:val="both"/>
-        <w:rPr>
-          <w:b/>
-          <w:sz w:val="24"/>
-          <w:szCs w:val="24"/>
-        </w:rPr>
-      </w:pPr>
-      <w:r>
-        <w:rPr>
-          <w:b/>
-          <w:spacing w:val="-5"/>
-          <w:sz w:val="24"/>
-          <w:szCs w:val="24"/>
-        </w:rPr>
-        <w:t>LATAR</w:t>
-      </w:r>
-      <w:r>
-        <w:rPr>
-          <w:b/>
-          <w:spacing w:val="-11"/>
-          <w:sz w:val="24"/>
-          <w:szCs w:val="24"/>
-        </w:rPr>
-        <w:t xml:space="preserve"> </w:t>
-      </w:r>
-      <w:r>
-        <w:rPr>
-          <w:b/>
-          <w:spacing w:val="-2"/>
-          <w:sz w:val="24"/>
-          <w:szCs w:val="24"/>
-        </w:rPr>
-        <w:t>BELAKANG</w:t>
-      </w:r>
-    </w:p>
-    <w:p>
-      <w:pPr>
-        <w:pStyle w:val="ListParagraph"/>
-        <w:widowControl/>
-        <w:autoSpaceDE/>
-        <w:autoSpaceDN/>
-        <w:spacing w:before="100" w:beforeAutospacing="1" w:after="100" w:afterAutospacing="1" w:line="276" w:lineRule="auto"/>
-        <w:ind w:left="360" w:firstLine="0"/>
-        <w:jc w:val="both"/>
-        <w:rPr>
-          <w:rFonts w:eastAsia="Times New Roman" w:cs="Times New Roman"/>
-          <w:sz w:val="24"/>
-          <w:szCs w:val="24"/>
-          <w:lang w:val="en-US"/>
-        </w:rPr>
-      </w:pPr>
-      <w:proofErr w:type="spellStart"/>
-      <w:r>
-        <w:rPr>
-          <w:rFonts w:eastAsia="Times New Roman" w:cs="Times New Roman"/>
-          <w:sz w:val="24"/>
-          <w:szCs w:val="24"/>
-          <w:lang w:val="en-US"/>
-        </w:rPr>
-        <w:t>{latarBelakang}</w:t>
-      </w:r>
-    </w:p>
-    <w:p>
-      <w:pPr>
-        <w:pStyle w:val="BodyText"/>
-        <w:spacing w:line="276" w:lineRule="auto"/>
-        <w:jc w:val="both"/>
-        <w:sectPr>
-          <w:headerReference w:type="default" r:id="rId8"/>
-          <w:type w:val="continuous"/>
-          <w:pgSz w:w="12240" w:h="15840"/>
-          <w:pgMar w:top="1340" w:right="1440" w:bottom="280" w:left="1800" w:header="0" w:footer="0" w:gutter="0"/>
-          <w:pgNumType w:start="1"/>
-          <w:cols w:space="720"/>
-        </w:sectPr>
-      </w:pPr>
-    </w:p>
-    <w:p>
-      <w:pPr>
-        <w:pStyle w:val="ListParagraph"/>
-        <w:numPr>
-          <w:ilvl w:val="0"/>
-          <w:numId w:val="1"/>
-        </w:numPr>
-        <w:spacing w:before="82" w:line="276" w:lineRule="auto"/>
-        <w:ind w:left="284" w:hanging="359"/>
-        <w:jc w:val="both"/>
-        <w:rPr>
-          <w:b/>
-          <w:sz w:val="24"/>
-          <w:szCs w:val="24"/>
-        </w:rPr>
-      </w:pPr>
-      <w:r>
-        <w:rPr>
-          <w:b/>
-          <w:spacing w:val="-2"/>
-          <w:sz w:val="24"/>
-          <w:szCs w:val="24"/>
-        </w:rPr>
-        <w:lastRenderedPageBreak/>
-        <w:t>TUJUAN</w:t>
-      </w:r>
-    </w:p>
-    <w:p>
-      <w:pPr>
-        <w:widowControl/>
-        <w:autoSpaceDE/>
-        <w:autoSpaceDN/>
-        <w:spacing w:line="276" w:lineRule="auto"/>
-        <w:jc w:val="both"/>
-        <w:rPr>
-          <w:rFonts w:eastAsia="Times New Roman" w:cs="Times New Roman"/>
-          <w:sz w:val="24"/>
-          <w:szCs w:val="24"/>
-          <w:lang w:val="en-US"/>
-        </w:rPr>
-      </w:pPr>
-      <w:r>
-        <w:rPr>
-          <w:sz w:val="24"/>
-          <w:szCs w:val="24"/>
+          <w:rFonts w:ascii="Arial" w:hAnsi="Arial" w:cs="Arial"/>
+          <w:sz w:val="22"/>
+          <w:szCs w:val="22"/>
         </w:rPr>
         <w:t xml:space="preserve">a. Tujuan Umum</w:t>
       </w:r>
     </w:p>
     <w:p>
       <w:pPr>
-        <w:widowControl/>
-        <w:autoSpaceDE/>
-        <w:autoSpaceDN/>
-        <w:spacing w:line="276" w:lineRule="auto"/>
+        <w:spacing w:before="0" w:after="120" w:line="276" w:lineRule="auto"/>
+        <w:ind w:left="720"/>
         <w:jc w:val="both"/>
+      </w:pPr>
+      <w:r>
         <w:rPr>
-          <w:rFonts w:eastAsia="Times New Roman" w:cs="Times New Roman"/>
-          <w:sz w:val="24"/>
-          <w:szCs w:val="24"/>
-          <w:lang w:val="en-US"/>
-        </w:rPr>
-      </w:pPr>
-      <w:r>
-        <w:rPr>
-          <w:sz w:val="24"/>
-          <w:szCs w:val="24"/>
+          <w:rFonts w:ascii="Arial" w:hAnsi="Arial" w:cs="Arial"/>
+          <w:sz w:val="22"/>
+          <w:szCs w:val="22"/>
         </w:rPr>
         <w:t xml:space="preserve">{tujuanUmum}</w:t>
       </w:r>
     </w:p>
     <w:p>
       <w:pPr>
-        <w:widowControl/>
-        <w:autoSpaceDE/>
-        <w:autoSpaceDN/>
-        <w:spacing w:line="276" w:lineRule="auto"/>
-        <w:jc w:val="both"/>
+        <w:spacing w:before="0" w:after="60" w:line="276" w:lineRule="auto"/>
+        <w:ind w:left="360"/>
+        <w:keepNext/>
+      </w:pPr>
+      <w:r>
         <w:rPr>
-          <w:rFonts w:eastAsia="Times New Roman" w:cs="Times New Roman"/>
-          <w:sz w:val="24"/>
-          <w:szCs w:val="24"/>
-          <w:lang w:val="en-US"/>
-        </w:rPr>
-      </w:pPr>
-      <w:r>
-        <w:rPr>
-          <w:sz w:val="24"/>
-          <w:szCs w:val="24"/>
+          <w:rFonts w:ascii="Arial" w:hAnsi="Arial" w:cs="Arial"/>
+          <w:sz w:val="22"/>
+          <w:szCs w:val="22"/>
         </w:rPr>
         <w:t xml:space="preserve">b. Tujuan Khusus</w:t>
       </w:r>
     </w:p>
     <w:p>
       <w:pPr>
-        <w:pStyle w:val="ListParagraph"/>
-        <w:widowControl/>
-        <w:numPr>
-          <w:ilvl w:val="0"/>
-          <w:numId w:val="5"/>
-        </w:numPr>
-        <w:autoSpaceDE/>
-        <w:autoSpaceDN/>
-        <w:spacing w:line="276" w:lineRule="auto"/>
+        <w:spacing w:before="0" w:after="40" w:line="276" w:lineRule="auto"/>
+        <w:ind w:left="1080" w:hanging="360"/>
         <w:jc w:val="both"/>
+      </w:pPr>
+      <w:r>
         <w:rPr>
-          <w:rFonts w:eastAsia="Times New Roman" w:cs="Times New Roman"/>
-          <w:sz w:val="24"/>
-          <w:szCs w:val="24"/>
-          <w:lang w:val="en-US"/>
+          <w:rFonts w:ascii="Arial" w:hAnsi="Arial" w:cs="Arial"/>
+          <w:sz w:val="22"/>
+          <w:szCs w:val="22"/>
         </w:rPr>
-      </w:pPr>
-      <w:proofErr w:type="spellStart"/>
+        <w:t xml:space="preserve">{#tujuanKhususList}</w:t>
+      </w:r>
+    </w:p>
+    <w:p>
+      <w:pPr>
+        <w:spacing w:before="0" w:after="40" w:line="276" w:lineRule="auto"/>
+        <w:ind w:left="1080" w:hanging="360"/>
+        <w:jc w:val="both"/>
+      </w:pPr>
       <w:r>
         <w:rPr>
-          <w:rFonts w:eastAsia="Times New Roman" w:cs="Times New Roman"/>
-          <w:sz w:val="24"/>
-          <w:szCs w:val="24"/>
-          <w:lang w:val="en-US"/>
+          <w:rFonts w:ascii="Arial" w:hAnsi="Arial" w:cs="Arial"/>
+          <w:sz w:val="22"/>
+          <w:szCs w:val="22"/>
         </w:rPr>
-        <w:t>{#tujuanKhususList}</w:t>
-      </w:r>
-    </w:p>
-    <w:p>
-      <w:pPr>
-        <w:pStyle w:val="ListParagraph"/>
-        <w:widowControl/>
-        <w:numPr>
-          <w:ilvl w:val="0"/>
-          <w:numId w:val="5"/>
-        </w:numPr>
-        <w:autoSpaceDE/>
-        <w:autoSpaceDN/>
-        <w:spacing w:line="276" w:lineRule="auto"/>
+        <w:t xml:space="preserve">- {.}</w:t>
+      </w:r>
+    </w:p>
+    <w:p>
+      <w:pPr>
+        <w:spacing w:before="0" w:after="40" w:line="276" w:lineRule="auto"/>
+        <w:ind w:left="1080" w:hanging="360"/>
         <w:jc w:val="both"/>
+      </w:pPr>
+      <w:r>
         <w:rPr>
-          <w:rFonts w:eastAsia="Times New Roman" w:cs="Times New Roman"/>
-          <w:sz w:val="24"/>
-          <w:szCs w:val="24"/>
-          <w:lang w:val="en-US"/>
+          <w:rFonts w:ascii="Arial" w:hAnsi="Arial" w:cs="Arial"/>
+          <w:sz w:val="22"/>
+          <w:szCs w:val="22"/>
         </w:rPr>
-      </w:pPr>
-      <w:proofErr w:type="spellStart"/>
+        <w:t xml:space="preserve">{/tujuanKhususList}</w:t>
+      </w:r>
+    </w:p>
+    <w:p>
+      <w:pPr>
+        <w:spacing w:before="240" w:after="120" w:line="276" w:lineRule="auto"/>
+        <w:keepNext/>
+      </w:pPr>
       <w:r>
         <w:rPr>
-          <w:rFonts w:eastAsia="Times New Roman" w:cs="Times New Roman"/>
-          <w:sz w:val="24"/>
-          <w:szCs w:val="24"/>
-          <w:lang w:val="en-US"/>
+          <w:rFonts w:ascii="Arial" w:hAnsi="Arial" w:cs="Arial"/>
+          <w:b/>
+          <w:bCs/>
+          <w:sz w:val="22"/>
+          <w:szCs w:val="22"/>
         </w:rPr>
-        <w:t>{.}</w:t>
-      </w:r>
-    </w:p>
-    <w:p>
-      <w:pPr>
-        <w:pStyle w:val="ListParagraph"/>
-        <w:widowControl/>
-        <w:numPr>
-          <w:ilvl w:val="0"/>
-          <w:numId w:val="3"/>
-        </w:numPr>
-        <w:autoSpaceDE/>
-        <w:autoSpaceDN/>
-        <w:spacing w:line="276" w:lineRule="auto"/>
+        <w:t xml:space="preserve">3. SASARAN</w:t>
+      </w:r>
+    </w:p>
+    <w:p>
+      <w:pPr>
+        <w:spacing w:before="0" w:after="40" w:line="276" w:lineRule="auto"/>
+        <w:ind w:left="1080" w:hanging="360"/>
         <w:jc w:val="both"/>
+      </w:pPr>
+      <w:r>
         <w:rPr>
-          <w:rFonts w:eastAsia="Times New Roman" w:cs="Times New Roman"/>
-          <w:sz w:val="24"/>
-          <w:szCs w:val="24"/>
-          <w:lang w:val="en-US"/>
+          <w:rFonts w:ascii="Arial" w:hAnsi="Arial" w:cs="Arial"/>
+          <w:sz w:val="22"/>
+          <w:szCs w:val="22"/>
         </w:rPr>
-      </w:pPr>
-      <w:proofErr w:type="spellStart"/>
+        <w:t xml:space="preserve">{#sasaranList}</w:t>
+      </w:r>
+    </w:p>
+    <w:p>
+      <w:pPr>
+        <w:spacing w:before="0" w:after="40" w:line="276" w:lineRule="auto"/>
+        <w:ind w:left="1080" w:hanging="360"/>
+        <w:jc w:val="both"/>
+      </w:pPr>
       <w:r>
         <w:rPr>
-          <w:rFonts w:eastAsia="Times New Roman" w:cs="Times New Roman"/>
-          <w:sz w:val="24"/>
-          <w:szCs w:val="24"/>
-          <w:lang w:val="en-US"/>
+          <w:rFonts w:ascii="Arial" w:hAnsi="Arial" w:cs="Arial"/>
+          <w:sz w:val="22"/>
+          <w:szCs w:val="22"/>
         </w:rPr>
-        <w:t>{/tujuanKhususList}</w:t>
-      </w:r>
-    </w:p>
-    <w:p>
-      <w:pPr>
-        <w:pStyle w:val="ListParagraph"/>
-        <w:widowControl/>
-        <w:autoSpaceDE/>
-        <w:autoSpaceDN/>
-        <w:spacing w:line="276" w:lineRule="auto"/>
-        <w:ind w:left="720" w:firstLine="0"/>
+        <w:t xml:space="preserve">- {.}</w:t>
+      </w:r>
+    </w:p>
+    <w:p>
+      <w:pPr>
+        <w:spacing w:before="0" w:after="40" w:line="276" w:lineRule="auto"/>
+        <w:ind w:left="1080" w:hanging="360"/>
         <w:jc w:val="both"/>
+      </w:pPr>
+      <w:r>
         <w:rPr>
+          <w:rFonts w:ascii="Arial" w:hAnsi="Arial" w:cs="Arial"/>
+          <w:sz w:val="22"/>
+          <w:szCs w:val="22"/>
+        </w:rPr>
+        <w:t xml:space="preserve">{/sasaranList}</w:t>
+      </w:r>
+    </w:p>
+    <w:p>
+      <w:pPr>
+        <w:spacing w:before="240" w:after="120" w:line="276" w:lineRule="auto"/>
+        <w:keepNext/>
+      </w:pPr>
+      <w:r>
+        <w:rPr>
+          <w:rFonts w:ascii="Arial" w:hAnsi="Arial" w:cs="Arial"/>
           <w:b/>
-          <w:sz w:val="24"/>
-          <w:szCs w:val="24"/>
+          <w:bCs/>
+          <w:sz w:val="22"/>
+          <w:szCs w:val="22"/>
         </w:rPr>
-      </w:pPr>
-    </w:p>
-    <w:p>
-      <w:pPr>
-        <w:pStyle w:val="ListParagraph"/>
-        <w:widowControl/>
-        <w:numPr>
-          <w:ilvl w:val="0"/>
-          <w:numId w:val="1"/>
-        </w:numPr>
-        <w:autoSpaceDE/>
-        <w:autoSpaceDN/>
-        <w:spacing w:line="276" w:lineRule="auto"/>
-        <w:jc w:val="both"/>
+        <w:t xml:space="preserve">4. RENCANA KEGIATAN</w:t>
+      </w:r>
+    </w:p>
+    <w:p>
+      <w:pPr>
+        <w:spacing w:before="0" w:after="40" w:line="276" w:lineRule="auto"/>
+        <w:ind w:left="360"/>
+      </w:pPr>
+      <w:r>
         <w:rPr>
-          <w:b/>
-          <w:sz w:val="24"/>
-          <w:szCs w:val="24"/>
+          <w:rFonts w:ascii="Arial" w:hAnsi="Arial" w:cs="Arial"/>
+          <w:sz w:val="22"/>
+          <w:szCs w:val="22"/>
         </w:rPr>
+        <w:t xml:space="preserve">a. Hari/Tanggal : {hariTanggal}</w:t>
+      </w:r>
+    </w:p>
+    <w:p>
+      <w:pPr>
+        <w:spacing w:before="0" w:after="40" w:line="276" w:lineRule="auto"/>
+        <w:ind w:left="360"/>
       </w:pPr>
       <w:r>
         <w:rPr>
-          <w:b/>
-          <w:spacing w:val="-2"/>
-          <w:sz w:val="24"/>
-          <w:szCs w:val="24"/>
+          <w:rFonts w:ascii="Arial" w:hAnsi="Arial" w:cs="Arial"/>
+          <w:sz w:val="22"/>
+          <w:szCs w:val="22"/>
         </w:rPr>
-        <w:t>SASARAN</w:t>
-      </w:r>
-    </w:p>
-    <w:p>
-      <w:pPr>
-        <w:pStyle w:val="ListParagraph"/>
-        <w:widowControl/>
-        <w:numPr>
-          <w:ilvl w:val="0"/>
-          <w:numId w:val="4"/>
-        </w:numPr>
-        <w:autoSpaceDE/>
-        <w:autoSpaceDN/>
-        <w:spacing w:line="276" w:lineRule="auto"/>
-        <w:jc w:val="both"/>
+        <w:t xml:space="preserve">b. Tempat          : {tempat}</w:t>
+      </w:r>
+    </w:p>
+    <w:p>
+      <w:pPr>
+        <w:spacing w:before="0" w:after="40" w:line="276" w:lineRule="auto"/>
+        <w:ind w:left="360"/>
+      </w:pPr>
+      <w:r>
         <w:rPr>
-          <w:rFonts w:eastAsia="Times New Roman" w:cs="Times New Roman"/>
-          <w:sz w:val="24"/>
-          <w:szCs w:val="24"/>
-          <w:lang w:val="en-US"/>
+          <w:rFonts w:ascii="Arial" w:hAnsi="Arial" w:cs="Arial"/>
+          <w:sz w:val="22"/>
+          <w:szCs w:val="22"/>
         </w:rPr>
-      </w:pPr>
-      <w:proofErr w:type="spellStart"/>
-      <w:r>
-        <w:rPr>
-          <w:rFonts w:eastAsia="Times New Roman" w:cs="Times New Roman"/>
-          <w:sz w:val="24"/>
-          <w:szCs w:val="24"/>
-          <w:lang w:val="en-US"/>
-        </w:rPr>
-        <w:t>{#sasaranList}</w:t>
-      </w:r>
-    </w:p>
-    <w:p>
-      <w:pPr>
-        <w:pStyle w:val="ListParagraph"/>
-        <w:widowControl/>
-        <w:numPr>
-          <w:ilvl w:val="0"/>
-          <w:numId w:val="4"/>
-        </w:numPr>
-        <w:autoSpaceDE/>
-        <w:autoSpaceDN/>
-        <w:spacing w:line="276" w:lineRule="auto"/>
-        <w:jc w:val="both"/>
-        <w:rPr>
-          <w:rFonts w:eastAsia="Times New Roman" w:cs="Times New Roman"/>
-          <w:sz w:val="24"/>
-          <w:szCs w:val="24"/>
-          <w:lang w:val="en-US"/>
-        </w:rPr>
-      </w:pPr>
-      <w:proofErr w:type="spellStart"/>
-      <w:r>
-        <w:rPr>
-          <w:rFonts w:eastAsia="Times New Roman" w:cs="Times New Roman"/>
-          <w:sz w:val="24"/>
-          <w:szCs w:val="24"/>
-          <w:lang w:val="en-US"/>
-        </w:rPr>
-        <w:t>{.}</w:t>
-      </w:r>
-    </w:p>
-    <w:p>
-      <w:pPr>
-        <w:pStyle w:val="ListParagraph"/>
-        <w:widowControl/>
-        <w:numPr>
-          <w:ilvl w:val="0"/>
-          <w:numId w:val="4"/>
-        </w:numPr>
-        <w:autoSpaceDE/>
-        <w:autoSpaceDN/>
-        <w:spacing w:line="276" w:lineRule="auto"/>
-        <w:jc w:val="both"/>
-        <w:rPr>
-          <w:rFonts w:eastAsia="Times New Roman" w:cs="Times New Roman"/>
-          <w:sz w:val="24"/>
-          <w:szCs w:val="24"/>
-          <w:lang w:val="en-US"/>
-        </w:rPr>
-      </w:pPr>
-      <w:proofErr w:type="spellStart"/>
-      <w:r>
-        <w:rPr>
-          <w:rFonts w:eastAsia="Times New Roman" w:cs="Times New Roman"/>
-          <w:sz w:val="24"/>
-          <w:szCs w:val="24"/>
-          <w:lang w:val="en-US"/>
-        </w:rPr>
-        <w:t>{/sasaranList}</w:t>
-      </w:r>
-    </w:p>
-    <w:p>
-      <w:pPr>
-        <w:pStyle w:val="ListParagraph"/>
-        <w:tabs>
-          <w:tab w:val="left" w:pos="359"/>
-        </w:tabs>
-        <w:spacing w:line="276" w:lineRule="auto"/>
-        <w:ind w:left="720" w:firstLine="0"/>
-        <w:jc w:val="both"/>
-        <w:rPr>
-          <w:rFonts w:cs="Arial"/>
-          <w:b/>
-          <w:sz w:val="24"/>
-          <w:szCs w:val="24"/>
-        </w:rPr>
-      </w:pPr>
-    </w:p>
-    <w:p>
-      <w:pPr>
-        <w:pStyle w:val="ListParagraph"/>
-        <w:numPr>
-          <w:ilvl w:val="0"/>
-          <w:numId w:val="1"/>
-        </w:numPr>
-        <w:tabs>
-          <w:tab w:val="left" w:pos="426"/>
-        </w:tabs>
-        <w:spacing w:before="1" w:line="276" w:lineRule="auto"/>
-        <w:ind w:left="284" w:hanging="359"/>
-        <w:jc w:val="both"/>
-        <w:rPr>
-          <w:b/>
-          <w:sz w:val="24"/>
-          <w:szCs w:val="24"/>
-        </w:rPr>
-      </w:pPr>
-      <w:r>
-        <w:rPr>
-          <w:b/>
-          <w:sz w:val="24"/>
-          <w:szCs w:val="24"/>
-        </w:rPr>
-        <w:t>RENCANA</w:t>
-      </w:r>
-      <w:r>
-        <w:rPr>
-          <w:b/>
-          <w:spacing w:val="-2"/>
-          <w:sz w:val="24"/>
-          <w:szCs w:val="24"/>
-        </w:rPr>
-        <w:t xml:space="preserve"> KEGIATAN</w:t>
-      </w:r>
-    </w:p>
-    <w:p>
-      <w:pPr>
-        <w:pStyle w:val="ListParagraph"/>
-        <w:numPr>
-          <w:ilvl w:val="1"/>
-          <w:numId w:val="1"/>
-        </w:numPr>
-        <w:spacing w:before="138" w:line="276" w:lineRule="auto"/>
-        <w:ind w:left="284" w:hanging="266"/>
-        <w:jc w:val="both"/>
-        <w:rPr>
-          <w:sz w:val="24"/>
-          <w:szCs w:val="24"/>
-        </w:rPr>
-      </w:pPr>
-      <w:r>
-        <w:rPr>
-          <w:sz w:val="24"/>
-          <w:szCs w:val="24"/>
-        </w:rPr>
-        <w:t>Hari/Tanggal: {hariTanggal}</w:t>
-      </w:r>
-    </w:p>
-    <w:p>
-      <w:pPr>
-        <w:pStyle w:val="ListParagraph"/>
-        <w:numPr>
-          <w:ilvl w:val="1"/>
-          <w:numId w:val="1"/>
-        </w:numPr>
-        <w:spacing w:before="138" w:line="276" w:lineRule="auto"/>
-        <w:ind w:left="284" w:hanging="266"/>
-        <w:jc w:val="both"/>
-        <w:rPr>
-          <w:sz w:val="24"/>
-          <w:szCs w:val="24"/>
-        </w:rPr>
-      </w:pPr>
-      <w:r>
-        <w:rPr>
-          <w:sz w:val="24"/>
-          <w:szCs w:val="24"/>
-        </w:rPr>
-        <w:t>Tempat: {tempat}</w:t>
-      </w:r>
-      <w:proofErr w:type="spellEnd"/>
-    </w:p>
-    <w:p>
-      <w:pPr>
-        <w:pStyle w:val="ListParagraph"/>
-        <w:numPr>
-          <w:ilvl w:val="1"/>
-          <w:numId w:val="1"/>
-        </w:numPr>
-        <w:spacing w:before="138" w:line="276" w:lineRule="auto"/>
-        <w:ind w:left="284" w:hanging="253"/>
-        <w:jc w:val="both"/>
-        <w:rPr>
-          <w:sz w:val="24"/>
-          <w:szCs w:val="24"/>
-        </w:rPr>
-      </w:pPr>
-      <w:r>
-        <w:rPr>
-          <w:b/>
-          <w:noProof/>
-          <w:sz w:val="24"/>
-          <w:szCs w:val="24"/>
-          <w:lang w:val="en-US"/>
-        </w:rPr>
-        <w:t>Narasumber: {narasumber}</w:t>
-      </w:r>
-    </w:p>
-    <w:p>
-      <w:pPr>
-        <w:spacing w:before="138" w:line="276" w:lineRule="auto"/>
-        <w:rPr>
-          <w:sz w:val="24"/>
-        </w:rPr>
-      </w:pPr>
-    </w:p>
-    <w:p>
-      <w:pPr>
-        <w:spacing w:before="480"/>
+        <w:t xml:space="preserve">c. Narasumber   : {narasumber}</w:t>
+      </w:r>
+    </w:p>
+    <w:p>
+      <w:pPr>
+        <w:spacing w:before="480" w:after="0"/>
       </w:pPr>
     </w:p>
     <w:tbl>
@@ -664,6 +341,7 @@
             </w:pPr>
             <w:r>
               <w:rPr>
+                <w:rFonts w:ascii="Arial" w:hAnsi="Arial" w:cs="Arial"/>
                 <w:sz w:val="22"/>
                 <w:szCs w:val="22"/>
               </w:rPr>
@@ -682,6 +360,7 @@
             </w:pPr>
             <w:r>
               <w:rPr>
+                <w:rFonts w:ascii="Arial" w:hAnsi="Arial" w:cs="Arial"/>
                 <w:sz w:val="22"/>
                 <w:szCs w:val="22"/>
               </w:rPr>
@@ -702,6 +381,7 @@
             </w:pPr>
             <w:r>
               <w:rPr>
+                <w:rFonts w:ascii="Arial" w:hAnsi="Arial" w:cs="Arial"/>
                 <w:sz w:val="22"/>
                 <w:szCs w:val="22"/>
               </w:rPr>
@@ -720,6 +400,7 @@
             </w:pPr>
             <w:r>
               <w:rPr>
+                <w:rFonts w:ascii="Arial" w:hAnsi="Arial" w:cs="Arial"/>
                 <w:sz w:val="22"/>
                 <w:szCs w:val="22"/>
               </w:rPr>
@@ -782,6 +463,7 @@
             </w:pPr>
             <w:r>
               <w:rPr>
+                <w:rFonts w:ascii="Arial" w:hAnsi="Arial" w:cs="Arial"/>
                 <w:sz w:val="22"/>
                 <w:szCs w:val="22"/>
               </w:rPr>
@@ -800,6 +482,7 @@
             </w:pPr>
             <w:r>
               <w:rPr>
+                <w:rFonts w:ascii="Arial" w:hAnsi="Arial" w:cs="Arial"/>
                 <w:sz w:val="22"/>
                 <w:szCs w:val="22"/>
               </w:rPr>

</xml_diff>

<commit_message>
template rab sama tor
</commit_message>
<xml_diff>
--- a/public/templates/Template_TOR.docx
+++ b/public/templates/Template_TOR.docx
@@ -16,22 +16,6 @@
           <w:bCs/>
         </w:rPr>
         <w:t xml:space="preserve">RINGKASAN KEGIATAN</w:t>
-      </w:r>
-    </w:p>
-    <w:p>
-      <w:pPr>
-        <w:spacing w:before="0" w:after="60" w:line="276" w:lineRule="auto"/>
-        <w:jc w:val="center"/>
-      </w:pPr>
-      <w:r>
-        <w:rPr>
-          <w:rFonts w:ascii="Arial" w:hAnsi="Arial" w:cs="Arial"/>
-          <w:sz w:val="22"/>
-          <w:szCs w:val="22"/>
-          <w:b/>
-          <w:bCs/>
-        </w:rPr>
-        <w:t xml:space="preserve">{judulProgramRKA}</w:t>
       </w:r>
     </w:p>
     <w:p>
@@ -493,8 +477,9 @@
       </w:tr>
     </w:tbl>
     <w:sectPr>
+      <w:headerReference w:type="default" r:id="rId8"/>
       <w:pgSz w:w="12240" w:h="15840"/>
-      <w:pgMar w:top="1340" w:right="1440" w:bottom="280" w:left="1800" w:header="0" w:footer="0" w:gutter="0"/>
+      <w:pgMar w:top="1340" w:right="1440" w:bottom="280" w:left="1800" w:header="432" w:footer="0" w:gutter="0"/>
       <w:cols w:space="720"/>
     </w:sectPr>
   </w:body>

</xml_diff>